<commit_message>
Update TempicoSoftware Manual: correct text in images
</commit_message>
<xml_diff>
--- a/docs/docs_user/archive/Tausand Tempico Software Manual 2.1.0.docx
+++ b/docs/docs_user/archive/Tausand Tempico Software Manual 2.1.0.docx
@@ -17787,10 +17787,10 @@
           <w:noProof/>
         </w:rPr>
         <w:drawing>
-          <wp:inline distT="0" distB="0" distL="0" distR="0" wp14:anchorId="4D8044BB" wp14:editId="0D0489E6">
+          <wp:inline distT="0" distB="0" distL="0" distR="0" wp14:anchorId="578F0B9D" wp14:editId="081ACAC7">
             <wp:extent cx="5612130" cy="1834515"/>
             <wp:effectExtent l="0" t="0" r="7620" b="0"/>
-            <wp:docPr id="1490114133" name="Imagen 4"/>
+            <wp:docPr id="1863461874" name="Imagen 4"/>
             <wp:cNvGraphicFramePr>
               <a:graphicFrameLocks xmlns:a="http://schemas.openxmlformats.org/drawingml/2006/main" noChangeAspect="1"/>
             </wp:cNvGraphicFramePr>
@@ -17798,11 +17798,11 @@
               <a:graphicData uri="http://schemas.openxmlformats.org/drawingml/2006/picture">
                 <pic:pic xmlns:pic="http://schemas.openxmlformats.org/drawingml/2006/picture">
                   <pic:nvPicPr>
-                    <pic:cNvPr id="1490114133" name="Imagen 1490114133"/>
+                    <pic:cNvPr id="1863461874" name="Imagen 1863461874"/>
                     <pic:cNvPicPr/>
                   </pic:nvPicPr>
                   <pic:blipFill>
-                    <a:blip r:embed="rId138" cstate="print">
+                    <a:blip r:embed="rId138">
                       <a:extLst>
                         <a:ext uri="{28A0092B-C50C-407E-A947-70E740481C1C}">
                           <a14:useLocalDpi xmlns:a14="http://schemas.microsoft.com/office/drawing/2010/main" val="0"/>
@@ -21828,6 +21828,7 @@
       <w:r>
         <w:rPr>
           <w:iCs/>
+          <w:noProof/>
         </w:rPr>
         <w:drawing>
           <wp:inline distT="0" distB="0" distL="0" distR="0" wp14:anchorId="5EB0D8A9" wp14:editId="4174B3FF">
@@ -22072,6 +22073,7 @@
       <w:r>
         <w:rPr>
           <w:iCs/>
+          <w:noProof/>
         </w:rPr>
         <w:drawing>
           <wp:inline distT="0" distB="0" distL="0" distR="0" wp14:anchorId="501C69AD" wp14:editId="4671EC4C">
@@ -22427,10 +22429,10 @@
         </w:rPr>
         <w:lastRenderedPageBreak/>
         <w:drawing>
-          <wp:inline distT="0" distB="0" distL="0" distR="0" wp14:anchorId="0D3DE673" wp14:editId="2BE12531">
-            <wp:extent cx="5308270" cy="2197064"/>
-            <wp:effectExtent l="0" t="0" r="6985" b="0"/>
-            <wp:docPr id="1842219034" name="Imagen 3"/>
+          <wp:inline distT="0" distB="0" distL="0" distR="0" wp14:anchorId="52335B73" wp14:editId="50DF3F24">
+            <wp:extent cx="5612130" cy="2325370"/>
+            <wp:effectExtent l="0" t="0" r="7620" b="0"/>
+            <wp:docPr id="1171958368" name="Imagen 3"/>
             <wp:cNvGraphicFramePr>
               <a:graphicFrameLocks xmlns:a="http://schemas.openxmlformats.org/drawingml/2006/main" noChangeAspect="1"/>
             </wp:cNvGraphicFramePr>
@@ -22438,7 +22440,7 @@
               <a:graphicData uri="http://schemas.openxmlformats.org/drawingml/2006/picture">
                 <pic:pic xmlns:pic="http://schemas.openxmlformats.org/drawingml/2006/picture">
                   <pic:nvPicPr>
-                    <pic:cNvPr id="1842219034" name="Imagen 1842219034"/>
+                    <pic:cNvPr id="1171958368" name="Imagen 1171958368"/>
                     <pic:cNvPicPr/>
                   </pic:nvPicPr>
                   <pic:blipFill>
@@ -22456,7 +22458,7 @@
                   <pic:spPr>
                     <a:xfrm>
                       <a:off x="0" y="0"/>
-                      <a:ext cx="5325714" cy="2204284"/>
+                      <a:ext cx="5612130" cy="2325370"/>
                     </a:xfrm>
                     <a:prstGeom prst="rect">
                       <a:avLst/>
@@ -24426,6 +24428,9 @@
         <w:jc w:val="center"/>
       </w:pPr>
       <w:r>
+        <w:rPr>
+          <w:noProof/>
+        </w:rPr>
         <w:drawing>
           <wp:inline distT="0" distB="0" distL="0" distR="0" wp14:anchorId="28C88156" wp14:editId="2F168361">
             <wp:extent cx="2495898" cy="1409897"/>
@@ -24619,6 +24624,9 @@
         <w:jc w:val="center"/>
       </w:pPr>
       <w:r>
+        <w:rPr>
+          <w:noProof/>
+        </w:rPr>
         <w:drawing>
           <wp:inline distT="0" distB="0" distL="0" distR="0" wp14:anchorId="64334CD4" wp14:editId="1F175A07">
             <wp:extent cx="2495898" cy="1409897"/>
@@ -24723,7 +24731,7 @@
           <w:noProof/>
         </w:rPr>
         <w:drawing>
-          <wp:inline distT="0" distB="0" distL="0" distR="0" wp14:anchorId="4B84BFFA" wp14:editId="08F4A16A">
+          <wp:inline distT="0" distB="0" distL="0" distR="0" wp14:anchorId="4B84BFFA" wp14:editId="2FDD1E46">
             <wp:extent cx="5522026" cy="2269490"/>
             <wp:effectExtent l="0" t="0" r="2540" b="0"/>
             <wp:docPr id="934478524" name="Imagen 13"/>
@@ -26638,6 +26646,7 @@
     <w:rsid w:val="0059660F"/>
     <w:rsid w:val="006900EA"/>
     <w:rsid w:val="006952F2"/>
+    <w:rsid w:val="006B54D3"/>
     <w:rsid w:val="006B7CB9"/>
     <w:rsid w:val="006F4741"/>
     <w:rsid w:val="007759F4"/>
@@ -26646,6 +26655,7 @@
     <w:rsid w:val="00854A65"/>
     <w:rsid w:val="008A0681"/>
     <w:rsid w:val="00925162"/>
+    <w:rsid w:val="009C3223"/>
     <w:rsid w:val="009D0744"/>
     <w:rsid w:val="009D54AA"/>
     <w:rsid w:val="009D632D"/>

</xml_diff>